<commit_message>
Fix team lead workload matrix rebuild after syntax error
Regenerate the job description so time ranks match actual multi-product
strategy, analytics, promotion, and cross-team meeting load.

Co-authored-by: slitasov <slitasov@users.noreply.github.com>
</commit_message>
<xml_diff>
--- a/docs/Должностная_инструкция_тимлид_продуктовый_запуск.docx
+++ b/docs/Должностная_инструкция_тимлид_продуктовый_запуск.docx
@@ -549,7 +549,7 @@
                 <w:color w:val="1A1A1A"/>
                 <w:sz w:val="17"/>
               </w:rPr>
-              <w:t>1.1</w:t>
+              <w:t>1.2</w:t>
             </w:r>
           </w:p>
         </w:tc>
@@ -826,7 +826,7 @@
           <w:color w:val="1A1A1A"/>
           <w:sz w:val="19"/>
         </w:rPr>
-        <w:t>Основная цель деятельности Тимлида — обеспечить результат группы через работу с менеджерами по продажам: их канбанами, сделками, качеством исполнения стандартов и развитием навыков. Большую часть рабочего времени Тимлид должен тратить на работу с МПП, а не на самостоятельное «закрытие» операционки вместо команды.</w:t>
+        <w:t>Фактический профиль роли Тимлида группы продуктового запуска — управление портфелем продуктов (одновременно минимум 3–5 запусков) через продуктовую стратегию, аналитику базы, финансовую аналитику, продвижение сервисов и плотную синхронизацию со смежными подразделениями. Работа с МПП (канбаны, сделки, обучение) остаётся обязательной зоной ответственности, но в текущей нагрузке занимает меньшую долю времени, чем продуктово-аналитический и кросс-функциональный контур.</w:t>
       </w:r>
     </w:p>
     <w:p>
@@ -840,7 +840,7 @@
           <w:color w:val="1A1A1A"/>
           <w:sz w:val="19"/>
         </w:rPr>
-        <w:t>Принцип распределения внимания:</w:t>
+        <w:t>Принцип распределения внимания (по фактической нагрузке):</w:t>
       </w:r>
     </w:p>
     <w:p>
@@ -855,7 +855,7 @@
           <w:color w:val="1A1A1A"/>
           <w:sz w:val="19"/>
         </w:rPr>
-        <w:t>Ядро роли (≥ 55–60% времени): канбаны и сделки МПП, коучинг, контроль качества, обучение, 1-1 и мотивация.</w:t>
+        <w:t>Основной объём времени (~75%+): продуктовые стратегии по 3–5+ продуктам, аналитика базы, финансовая аналитика, маркетинг / мероприятия продвижения, встречи со смежными подразделениями.</w:t>
       </w:r>
     </w:p>
     <w:p>
@@ -870,7 +870,7 @@
           <w:color w:val="1A1A1A"/>
           <w:sz w:val="19"/>
         </w:rPr>
-        <w:t>Поддержка ядра: гипотезы, КП / скрипты, стыки со смежными отделами, контроль плана.</w:t>
+        <w:t>Обязательный управленческий контур: канбаны и ключевые сделки МПП, короткое обучение под изменения продуктов, точечные 1-1.</w:t>
       </w:r>
     </w:p>
     <w:p>
@@ -885,7 +885,7 @@
           <w:color w:val="1A1A1A"/>
           <w:sz w:val="19"/>
         </w:rPr>
-        <w:t>Обеспечивающие функции (меньший вес по времени, но обязательные): бюджет / KPI / ЗП, конкурентный анализ, найм, регламенты, саморазвитие.</w:t>
+        <w:t>Сложность роли усиливается параллельным ведением нескольких продуктов: решения и встречи масштабируются не «на 1 продукт», а на весь портфель.</w:t>
       </w:r>
     </w:p>
     <w:p>
@@ -900,7 +900,7 @@
           <w:color w:val="1A1A1A"/>
           <w:sz w:val="19"/>
         </w:rPr>
-        <w:t>Продуктовый результат достигается через сильную команду МПП: чем лучше Тимлид управляет людьми и сделками, тем быстрее проверяются гипотезы запуска.</w:t>
+        <w:t>Целевой баланс на перспективу: сохраняя сильный продуктово-аналитический контур, возвращать больше времени в работу с МПП и их сделками — это усиливает скорость проверки гипотез на рынке.</w:t>
       </w:r>
     </w:p>
     <w:p>
@@ -931,7 +931,7 @@
           <w:color w:val="1A1A1A"/>
           <w:sz w:val="17"/>
         </w:rPr>
-        <w:t>Функции проранжированы от наиболее важных (сильнее влияют на результат роли) к менее важным. Затраты времени — ориентир на месяц при норме ≈ 168 рабочих часов. Итого ориентиров в таблице ≈ 164 ч; остаток — буфер на срочные эскалации и запуски.</w:t>
+        <w:t>Функции проранжированы от наиболее влияющих на фактическую нагрузку роли к менее влияющим. Затраты времени — практический ориентир при норме ≈ 168–176 рабочих часов и параллельном ведении 3–5+ продуктов. Итого в таблице ≈ 171 ч; пиковые недели запусков / мероприятий могут превышать норму за счёт встреч и срочной аналитики.</w:t>
       </w:r>
     </w:p>
     <w:tbl>
@@ -1201,7 +1201,7 @@
                 <w:color w:val="1A1A1A"/>
                 <w:sz w:val="15"/>
               </w:rPr>
-              <w:t>Операционная работа с МПП: разбор канбанов, сделок, следующих шагов и «красных» зон по каждому менеджеру</w:t>
+              <w:t>Проработка продуктовых стратегий по портфелю запусков (одновременно 3–5+ продуктов): гипотезы, позиционирование, приоритеты вывода на рынок</w:t>
             </w:r>
           </w:p>
         </w:tc>
@@ -1236,7 +1236,7 @@
                 <w:color w:val="1A1A1A"/>
                 <w:sz w:val="15"/>
               </w:rPr>
-              <w:t>45 ч / мес (~27%)</w:t>
+              <w:t>36 ч / мес (~21%)</w:t>
             </w:r>
           </w:p>
         </w:tc>
@@ -1271,7 +1271,7 @@
                 <w:color w:val="1A1A1A"/>
                 <w:sz w:val="15"/>
               </w:rPr>
-              <w:t>Актуальная картина канбанов; список проблемных сделок; согласованные next steps; прогноз выполнения плана по МПП</w:t>
+              <w:t>Стратегия / one-pager по каждому продукту; приоритеты квартала; go / iterate / stop; обновлённый оффер</w:t>
             </w:r>
           </w:p>
         </w:tc>
@@ -1306,7 +1306,7 @@
                 <w:color w:val="1A1A1A"/>
                 <w:sz w:val="15"/>
               </w:rPr>
-              <w:t>Доступ к CRM/канбану МПП; стадии воронки; дашборд сделок; возможность видеть историю касаний и комментарии</w:t>
+              <w:t>Карточки продуктов; ограничения ЦРП; конкурентный контекст; факты воронки; решения руководства по приоритетам портфеля</w:t>
             </w:r>
           </w:p>
         </w:tc>
@@ -1381,7 +1381,7 @@
                 <w:color w:val="1A1A1A"/>
                 <w:sz w:val="15"/>
               </w:rPr>
-              <w:t>Контроль качества продаж и коучинг: скрипты холодной / тёплой / горячей базы, разбор звонков, стандарты диалога</w:t>
+              <w:t>Аналитика базы: сегменты, качество контактов, конверсии этапов, «узкие места» воронки по продуктам и МПП</w:t>
             </w:r>
           </w:p>
         </w:tc>
@@ -1416,7 +1416,7 @@
                 <w:color w:val="1A1A1A"/>
                 <w:sz w:val="15"/>
               </w:rPr>
-              <w:t>26 ч / мес (~15%)</w:t>
+              <w:t>28 ч / мес (~16%)</w:t>
             </w:r>
           </w:p>
         </w:tc>
@@ -1451,7 +1451,7 @@
                 <w:color w:val="1A1A1A"/>
                 <w:sz w:val="15"/>
               </w:rPr>
-              <w:t>Чек-листы качества; протоколы разборов; скорректированный скрипт; % соответствия стандарту; индивидуальные точки роста МПП</w:t>
+              <w:t>Аналитические срезы базы; выводы по сегментам; список действий для МПП / маркетинга; корректировка скрипта и приоритетов обзвона</w:t>
             </w:r>
           </w:p>
         </w:tc>
@@ -1486,7 +1486,7 @@
                 <w:color w:val="1A1A1A"/>
                 <w:sz w:val="15"/>
               </w:rPr>
-              <w:t>Записи звонков; актуальные скрипты; критерии оценки; доступ к карточке сделки</w:t>
+              <w:t>Выгрузки / дашборды CRM; правила сегментации; история касаний; статусы сделок; при необходимости сверка с УТ</w:t>
             </w:r>
           </w:p>
         </w:tc>
@@ -1561,7 +1561,7 @@
                 <w:color w:val="1A1A1A"/>
                 <w:sz w:val="15"/>
               </w:rPr>
-              <w:t>Обучение МПП новым продуктам и закрепление навыка на реальных сделках</w:t>
+              <w:t>Финансовая аналитика запусков: план/факт, экономика продуктов, мотивация, бюджеты и отклонения</w:t>
             </w:r>
           </w:p>
         </w:tc>
@@ -1596,7 +1596,7 @@
                 <w:color w:val="1A1A1A"/>
                 <w:sz w:val="15"/>
               </w:rPr>
-              <w:t>18 ч / мес (~11%)</w:t>
+              <w:t>24 ч / мес (~14%)</w:t>
             </w:r>
           </w:p>
         </w:tc>
@@ -1631,7 +1631,7 @@
                 <w:color w:val="1A1A1A"/>
                 <w:sz w:val="15"/>
               </w:rPr>
-              <w:t>Обучающий пакет; протокол обучения; допуск МПП к продукту; срез знаний; рост конверсии на новом продукте</w:t>
+              <w:t>Финмодель / план-факт; выводы по марже и окупаемости; корректировка KPI и мотивации; аргументы для решений по портфелю</w:t>
             </w:r>
           </w:p>
         </w:tc>
@@ -1666,7 +1666,7 @@
                 <w:color w:val="1A1A1A"/>
                 <w:sz w:val="15"/>
               </w:rPr>
-              <w:t>Карточка продукта (ценность / ограничения / УТП); демо-доступ; кейсы; эталонные звонки; согласованный оффер</w:t>
+              <w:t>Выгрузки продаж из УТ; оплаты / отгрузки; правила мотивации; бюджеты рекламы; план продаж по продуктам</w:t>
             </w:r>
           </w:p>
         </w:tc>
@@ -1741,7 +1741,7 @@
                 <w:color w:val="1A1A1A"/>
                 <w:sz w:val="15"/>
               </w:rPr>
-              <w:t>1-1, мотивация, оценка эффективности МПП и планы развития</w:t>
+              <w:t>Маркетинговые стратегии и организация мероприятий по продвижению сервисов (вебинары, акции, спецпредложения, партнёрские активности)</w:t>
             </w:r>
           </w:p>
         </w:tc>
@@ -1776,7 +1776,7 @@
                 <w:color w:val="1A1A1A"/>
                 <w:sz w:val="15"/>
               </w:rPr>
-              <w:t>12 ч / мес (~7%)</w:t>
+              <w:t>22 ч / мес (~13%)</w:t>
             </w:r>
           </w:p>
         </w:tc>
@@ -1811,7 +1811,7 @@
                 <w:color w:val="1A1A1A"/>
                 <w:sz w:val="15"/>
               </w:rPr>
-              <w:t>Протоколы 1-1; ИПР; решения по мотивации / кадровым рискам; прозрачная обратная связь сотруднику</w:t>
+              <w:t>План продвижения; ТЗ / сценарий мероприятия; оффер акции; пост-аналитика эффекта на базу и сделки</w:t>
             </w:r>
           </w:p>
         </w:tc>
@@ -1846,7 +1846,7 @@
                 <w:color w:val="1A1A1A"/>
                 <w:sz w:val="15"/>
               </w:rPr>
-              <w:t>KPI и факт по менеджеру; данные канбана; карта компетенций; правила мотивации</w:t>
+              <w:t>Слоты и ресурсы маркетинга; сегмент базы; креативы / лендинги; согласование формулировок; каналы регистрации и CRM-метки</w:t>
             </w:r>
           </w:p>
         </w:tc>
@@ -1858,7 +1858,7 @@
         <w:tc>
           <w:tcPr>
             <w:tcW w:type="dxa" w:w="1134"/>
-            <w:shd w:val="clear" w:color="auto" w:fill="FFFFFF"/>
+            <w:shd w:val="clear" w:color="auto" w:fill="F0F7FB"/>
             <w:tcBorders>
               <w:top w:val="single" w:sz="6" w:space="0" w:color="D0D0D0"/>
               <w:left w:val="single" w:sz="6" w:space="0" w:color="D0D0D0"/>
@@ -1893,7 +1893,7 @@
         <w:tc>
           <w:tcPr>
             <w:tcW w:type="dxa" w:w="4082"/>
-            <w:shd w:val="clear" w:color="auto" w:fill="FFFFFF"/>
+            <w:shd w:val="clear" w:color="auto" w:fill="F0F7FB"/>
             <w:tcBorders>
               <w:top w:val="single" w:sz="6" w:space="0" w:color="D0D0D0"/>
               <w:left w:val="single" w:sz="6" w:space="0" w:color="D0D0D0"/>
@@ -1921,7 +1921,7 @@
                 <w:color w:val="1A1A1A"/>
                 <w:sz w:val="15"/>
               </w:rPr>
-              <w:t>Проверка продуктовых и коммерческих гипотез через команду и рынок</w:t>
+              <w:t>Встречи и синхронизация с другими подразделениями по продуктам (продукт / ЦРП, маркетинг, финблок, поддержка, смежные продажи)</w:t>
             </w:r>
           </w:p>
         </w:tc>
@@ -1956,7 +1956,7 @@
                 <w:color w:val="1A1A1A"/>
                 <w:sz w:val="15"/>
               </w:rPr>
-              <w:t>10 ч / мес (~6%)</w:t>
+              <w:t>22 ч / мес (~13%)</w:t>
             </w:r>
           </w:p>
         </w:tc>
@@ -1991,7 +1991,7 @@
                 <w:color w:val="1A1A1A"/>
                 <w:sz w:val="15"/>
               </w:rPr>
-              <w:t>Отчёт по гипотезам; вывод go / iterate / stop; правки оффера и скрипта на основе практики</w:t>
+              <w:t>Протоколы договорённостей; закрытые эскалации; согласованные сроки / ограничения продукта; единый статус для команды</w:t>
             </w:r>
           </w:p>
         </w:tc>
@@ -2026,7 +2026,7 @@
                 <w:color w:val="1A1A1A"/>
                 <w:sz w:val="15"/>
               </w:rPr>
-              <w:t>Сводка возражений МПП; выгрузка воронки из CRM; обратная связь с демо; вводные от продукта / маркетинга</w:t>
+              <w:t>Календарь стейкхолдеров; статусы доработок; вводные по лицензиям / ограничениям; материалы запусков</w:t>
             </w:r>
           </w:p>
         </w:tc>
@@ -2101,7 +2101,7 @@
                 <w:color w:val="1A1A1A"/>
                 <w:sz w:val="15"/>
               </w:rPr>
-              <w:t>Формирование и актуализация КП, позиционирования и скриптов под запуск</w:t>
+              <w:t>Операционная работа с МПП: канбаны, ключевые сделки, next steps и контроль исполнения по продуктам портфеля</w:t>
             </w:r>
           </w:p>
         </w:tc>
@@ -2136,7 +2136,7 @@
                 <w:color w:val="1A1A1A"/>
                 <w:sz w:val="15"/>
               </w:rPr>
-              <w:t>10 ч / мес (~6%)</w:t>
+              <w:t>14 ч / мес (~8%)</w:t>
             </w:r>
           </w:p>
         </w:tc>
@@ -2171,7 +2171,7 @@
                 <w:color w:val="1A1A1A"/>
                 <w:sz w:val="15"/>
               </w:rPr>
-              <w:t>КП / one-pager; документ позиционирования; скрипт под сегмент; краткая шпаргалка для МПП</w:t>
+              <w:t>Актуальная картина канбанов; список критичных сделок; решения по следующим шагам; прогноз по плану</w:t>
             </w:r>
           </w:p>
         </w:tc>
@@ -2206,7 +2206,7 @@
                 <w:color w:val="1A1A1A"/>
                 <w:sz w:val="15"/>
               </w:rPr>
-              <w:t>Вводные от ЦРП / продукта; ограничения лицензирования; конкурентные материалы; согласование формулировок</w:t>
+              <w:t>CRM / канбан МПП; стадии воронки; комментарии по сделкам; понимание текущего приоритета продуктов</w:t>
             </w:r>
           </w:p>
         </w:tc>
@@ -2281,7 +2281,7 @@
                 <w:color w:val="1A1A1A"/>
                 <w:sz w:val="15"/>
               </w:rPr>
-              <w:t>Взаимодействие со смежными отделами (маркетинг, продукт / ЦРП, поддержка, финблок)</w:t>
+              <w:t>Контроль качества продаж и короткое обучение МПП под текущие продукты / акции / изменения оффера</w:t>
             </w:r>
           </w:p>
         </w:tc>
@@ -2316,7 +2316,7 @@
                 <w:color w:val="1A1A1A"/>
                 <w:sz w:val="15"/>
               </w:rPr>
-              <w:t>10 ч / мес (~6%)</w:t>
+              <w:t>8 ч / мес (~5%)</w:t>
             </w:r>
           </w:p>
         </w:tc>
@@ -2351,7 +2351,7 @@
                 <w:color w:val="1A1A1A"/>
                 <w:sz w:val="15"/>
               </w:rPr>
-              <w:t>Согласованные стыки процессов; протоколы встреч; закрытые эскалации; актуальный статус запуска для команды</w:t>
+              <w:t>Обновлённые скрипты / шпаргалки; мини-разборы; быстрый допуск МПП к изменениям продукта</w:t>
             </w:r>
           </w:p>
         </w:tc>
@@ -2386,7 +2386,7 @@
                 <w:color w:val="1A1A1A"/>
                 <w:sz w:val="15"/>
               </w:rPr>
-              <w:t>Владельцы процессов; каналы эскалации; статусы рекламных активностей; ограничения продукта</w:t>
+              <w:t>Актуальный оффер; записи звонков; краткие product notes; критерии качества</w:t>
             </w:r>
           </w:p>
         </w:tc>
@@ -2461,7 +2461,7 @@
                 <w:color w:val="1A1A1A"/>
                 <w:sz w:val="15"/>
               </w:rPr>
-              <w:t>Контроль плана продаж группы и операционных показателей воронки</w:t>
+              <w:t>Подготовка КП, скриптов и продуктовых материалов под несколько параллельных запусков</w:t>
             </w:r>
           </w:p>
         </w:tc>
@@ -2496,7 +2496,7 @@
                 <w:color w:val="1A1A1A"/>
                 <w:sz w:val="15"/>
               </w:rPr>
-              <w:t>8 ч / мес (~5%)</w:t>
+              <w:t>6 ч / мес (~4%)</w:t>
             </w:r>
           </w:p>
         </w:tc>
@@ -2531,7 +2531,7 @@
                 <w:color w:val="1A1A1A"/>
                 <w:sz w:val="15"/>
               </w:rPr>
-              <w:t>Еженедельный / месячный отчёт по плану; отклонения и план действий; валидация гипотез цифрами</w:t>
+              <w:t>КП / one-pager / скрипт / FAQ по продуктам портфеля</w:t>
             </w:r>
           </w:p>
         </w:tc>
@@ -2566,7 +2566,7 @@
                 <w:color w:val="1A1A1A"/>
                 <w:sz w:val="15"/>
               </w:rPr>
-              <w:t>План продаж; дашборд воронки; выгрузки из CRM; при необходимости сверка с УТ по отгрузкам / оплатам</w:t>
+              <w:t>Вводные ЦРП; согласованные формулировки; конкурентные отличия; ограничения внедрения</w:t>
             </w:r>
           </w:p>
         </w:tc>
@@ -2641,7 +2641,7 @@
                 <w:color w:val="1A1A1A"/>
                 <w:sz w:val="15"/>
               </w:rPr>
-              <w:t>Бюджет группы, KPI, расчёт мотивации / ЗП</w:t>
+              <w:t>1-1, мотивация и кадровые решения по МПП</w:t>
             </w:r>
           </w:p>
         </w:tc>
@@ -2676,7 +2676,7 @@
                 <w:color w:val="1A1A1A"/>
                 <w:sz w:val="15"/>
               </w:rPr>
-              <w:t>6 ч / мес (~4%)</w:t>
+              <w:t>4 ч / мес (~2%)</w:t>
             </w:r>
           </w:p>
         </w:tc>
@@ -2711,7 +2711,7 @@
                 <w:color w:val="1A1A1A"/>
                 <w:sz w:val="15"/>
               </w:rPr>
-              <w:t>Финплан проекта / группы; утверждённые KPI; расчёт мотивации; понятные правила для МПП</w:t>
+              <w:t>Протоколы 1-1; решения по мотивации / рискам; точечные ИПР</w:t>
             </w:r>
           </w:p>
         </w:tc>
@@ -2746,7 +2746,7 @@
                 <w:color w:val="1A1A1A"/>
                 <w:sz w:val="15"/>
               </w:rPr>
-              <w:t>Выгрузки продаж из УТ; правила мотивации; табель / активности CRM; согласованные ставки и пороги</w:t>
+              <w:t>Факт KPI; данные по сделкам; правила мотивации</w:t>
             </w:r>
           </w:p>
         </w:tc>
@@ -2821,7 +2821,7 @@
                 <w:color w:val="1A1A1A"/>
                 <w:sz w:val="15"/>
               </w:rPr>
-              <w:t>Анализ конкурентов и эффективности маркетинговых подходов на уровне команды</w:t>
+              <w:t>Развитие партнёрского / агентского канала совместно с ЦРП</w:t>
             </w:r>
           </w:p>
         </w:tc>
@@ -2856,7 +2856,7 @@
                 <w:color w:val="1A1A1A"/>
                 <w:sz w:val="15"/>
               </w:rPr>
-              <w:t>5 ч / мес (~3%)</w:t>
+              <w:t>3 ч / мес (~2%)</w:t>
             </w:r>
           </w:p>
         </w:tc>
@@ -2891,7 +2891,7 @@
                 <w:color w:val="1A1A1A"/>
                 <w:sz w:val="15"/>
               </w:rPr>
-              <w:t>Карта конкурентов / входа на рынок; рекомендации в скрипт и оффер; выводы для гипотез</w:t>
+              <w:t>Статус партнёрского канала; план касаний; гипотезы через партнёров</w:t>
             </w:r>
           </w:p>
         </w:tc>
@@ -2926,7 +2926,7 @@
                 <w:color w:val="1A1A1A"/>
                 <w:sz w:val="15"/>
               </w:rPr>
-              <w:t>Открытые источники; данные маркетинга; feedback МПП с линии; материалы конкурентов</w:t>
+              <w:t>Условия партнёрок; контакты ЦРП; CRM партнёрских сделок</w:t>
             </w:r>
           </w:p>
         </w:tc>
@@ -3001,7 +3001,7 @@
                 <w:color w:val="1A1A1A"/>
                 <w:sz w:val="15"/>
               </w:rPr>
-              <w:t>Развитие партнёрской / агентской сети совместно с ЦРП</w:t>
+              <w:t>Участие в подборе / онбординге МПП и поддержка процессов группы</w:t>
             </w:r>
           </w:p>
         </w:tc>
@@ -3036,7 +3036,7 @@
                 <w:color w:val="1A1A1A"/>
                 <w:sz w:val="15"/>
               </w:rPr>
-              <w:t>4 ч / мес (~2%)</w:t>
+              <w:t>2 ч / мес (~1%)</w:t>
             </w:r>
           </w:p>
         </w:tc>
@@ -3071,7 +3071,7 @@
                 <w:color w:val="1A1A1A"/>
                 <w:sz w:val="15"/>
               </w:rPr>
-              <w:t>Статус партнёрского канала; план касаний; сделки / гипотезы через партнёров</w:t>
+              <w:t>Оценка кандидата / план адаптации; точечные правки регламентов</w:t>
             </w:r>
           </w:p>
         </w:tc>
@@ -3106,7 +3106,7 @@
                 <w:color w:val="1A1A1A"/>
                 <w:sz w:val="15"/>
               </w:rPr>
-              <w:t>Условия партнёрок; контакты ЦРП; CRM по партнёрским сделкам</w:t>
+              <w:t>Профиль роли; чек-лист онбординга; as-is процессов</w:t>
             </w:r>
           </w:p>
         </w:tc>
@@ -3181,7 +3181,7 @@
                 <w:color w:val="1A1A1A"/>
                 <w:sz w:val="15"/>
               </w:rPr>
-              <w:t>Участие в подборе и онбординге МПП</w:t>
+              <w:t>Собственное развитие и фиксация лучших практик запусков</w:t>
             </w:r>
           </w:p>
         </w:tc>
@@ -3216,7 +3216,7 @@
                 <w:color w:val="1A1A1A"/>
                 <w:sz w:val="15"/>
               </w:rPr>
-              <w:t>4 ч / мес (~2%)</w:t>
+              <w:t>2 ч / мес (~1%)</w:t>
             </w:r>
           </w:p>
         </w:tc>
@@ -3251,7 +3251,7 @@
                 <w:color w:val="1A1A1A"/>
                 <w:sz w:val="15"/>
               </w:rPr>
-              <w:t>Оценка кандидата; решение по найму; план адаптации на 30 / 60 / 90 дней</w:t>
+              <w:t>Короткие практики / памятки; личные выводы по портфелю продуктов</w:t>
             </w:r>
           </w:p>
         </w:tc>
@@ -3286,367 +3286,7 @@
                 <w:color w:val="1A1A1A"/>
                 <w:sz w:val="15"/>
               </w:rPr>
-              <w:t>Профиль должности; кейсы собеседования; доступы и чек-лист онбординга</w:t>
-            </w:r>
-          </w:p>
-        </w:tc>
-      </w:tr>
-      <w:tr>
-        <w:trPr>
-          <w:trHeight w:val="879" w:hRule="atLeast"/>
-        </w:trPr>
-        <w:tc>
-          <w:tcPr>
-            <w:tcW w:type="dxa" w:w="1134"/>
-            <w:shd w:val="clear" w:color="auto" w:fill="FFFFFF"/>
-            <w:tcBorders>
-              <w:top w:val="single" w:sz="6" w:space="0" w:color="D0D0D0"/>
-              <w:left w:val="single" w:sz="6" w:space="0" w:color="D0D0D0"/>
-              <w:bottom w:val="single" w:sz="6" w:space="0" w:color="D0D0D0"/>
-              <w:right w:val="single" w:sz="6" w:space="0" w:color="D0D0D0"/>
-            </w:tcBorders>
-            <w:tcMar>
-              <w:top w:w="40" w:type="dxa"/>
-              <w:left w:w="50" w:type="dxa"/>
-              <w:bottom w:w="40" w:type="dxa"/>
-              <w:right w:w="50" w:type="dxa"/>
-            </w:tcMar>
-            <w:vAlign w:val="center"/>
-          </w:tcPr>
-          <w:p>
-            <w:pPr>
-              <w:spacing w:before="0" w:after="0" w:line="264" w:lineRule="auto"/>
-              <w:jc w:val="center"/>
-            </w:pPr>
-            <w:r/>
-            <w:r>
-              <w:rPr>
-                <w:rFonts w:ascii="Verdana" w:hAnsi="Verdana" w:cs="Verdana" w:eastAsia="Verdana"/>
-                <w:b/>
-                <w:color w:val="1A1A1A"/>
-                <w:sz w:val="18"/>
-              </w:rPr>
-              <w:t>13</w:t>
-            </w:r>
-          </w:p>
-        </w:tc>
-        <w:tc>
-          <w:tcPr>
-            <w:tcW w:type="dxa" w:w="4082"/>
-            <w:shd w:val="clear" w:color="auto" w:fill="FFFFFF"/>
-            <w:tcBorders>
-              <w:top w:val="single" w:sz="6" w:space="0" w:color="D0D0D0"/>
-              <w:left w:val="single" w:sz="6" w:space="0" w:color="D0D0D0"/>
-              <w:bottom w:val="single" w:sz="6" w:space="0" w:color="D0D0D0"/>
-              <w:right w:val="single" w:sz="6" w:space="0" w:color="D0D0D0"/>
-            </w:tcBorders>
-            <w:tcMar>
-              <w:top w:w="40" w:type="dxa"/>
-              <w:left w:w="50" w:type="dxa"/>
-              <w:bottom w:w="40" w:type="dxa"/>
-              <w:right w:w="50" w:type="dxa"/>
-            </w:tcMar>
-            <w:vAlign w:val="center"/>
-          </w:tcPr>
-          <w:p>
-            <w:pPr>
-              <w:spacing w:before="0" w:after="0" w:line="264" w:lineRule="auto"/>
-              <w:jc w:val="left"/>
-            </w:pPr>
-            <w:r/>
-            <w:r>
-              <w:rPr>
-                <w:rFonts w:ascii="Verdana" w:hAnsi="Verdana" w:cs="Verdana" w:eastAsia="Verdana"/>
-                <w:b w:val="0"/>
-                <w:color w:val="1A1A1A"/>
-                <w:sz w:val="15"/>
-              </w:rPr>
-              <w:t>Формализация и оптимизация процессов группы и регламентов взаимодействия</w:t>
-            </w:r>
-          </w:p>
-        </w:tc>
-        <w:tc>
-          <w:tcPr>
-            <w:tcW w:type="dxa" w:w="2041"/>
-            <w:shd w:val="clear" w:color="auto" w:fill="FFFFFF"/>
-            <w:tcBorders>
-              <w:top w:val="single" w:sz="6" w:space="0" w:color="D0D0D0"/>
-              <w:left w:val="single" w:sz="6" w:space="0" w:color="D0D0D0"/>
-              <w:bottom w:val="single" w:sz="6" w:space="0" w:color="D0D0D0"/>
-              <w:right w:val="single" w:sz="6" w:space="0" w:color="D0D0D0"/>
-            </w:tcBorders>
-            <w:tcMar>
-              <w:top w:w="40" w:type="dxa"/>
-              <w:left w:w="50" w:type="dxa"/>
-              <w:bottom w:w="40" w:type="dxa"/>
-              <w:right w:w="50" w:type="dxa"/>
-            </w:tcMar>
-            <w:vAlign w:val="center"/>
-          </w:tcPr>
-          <w:p>
-            <w:pPr>
-              <w:spacing w:before="0" w:after="0" w:line="264" w:lineRule="auto"/>
-              <w:jc w:val="center"/>
-            </w:pPr>
-            <w:r/>
-            <w:r>
-              <w:rPr>
-                <w:rFonts w:ascii="Verdana" w:hAnsi="Verdana" w:cs="Verdana" w:eastAsia="Verdana"/>
-                <w:b w:val="0"/>
-                <w:color w:val="1A1A1A"/>
-                <w:sz w:val="15"/>
-              </w:rPr>
-              <w:t>3 ч / мес (~2%)</w:t>
-            </w:r>
-          </w:p>
-        </w:tc>
-        <w:tc>
-          <w:tcPr>
-            <w:tcW w:type="dxa" w:w="3969"/>
-            <w:shd w:val="clear" w:color="auto" w:fill="FFFFFF"/>
-            <w:tcBorders>
-              <w:top w:val="single" w:sz="6" w:space="0" w:color="D0D0D0"/>
-              <w:left w:val="single" w:sz="6" w:space="0" w:color="D0D0D0"/>
-              <w:bottom w:val="single" w:sz="6" w:space="0" w:color="D0D0D0"/>
-              <w:right w:val="single" w:sz="6" w:space="0" w:color="D0D0D0"/>
-            </w:tcBorders>
-            <w:tcMar>
-              <w:top w:w="40" w:type="dxa"/>
-              <w:left w:w="50" w:type="dxa"/>
-              <w:bottom w:w="40" w:type="dxa"/>
-              <w:right w:w="50" w:type="dxa"/>
-            </w:tcMar>
-            <w:vAlign w:val="center"/>
-          </w:tcPr>
-          <w:p>
-            <w:pPr>
-              <w:spacing w:before="0" w:after="0" w:line="264" w:lineRule="auto"/>
-              <w:jc w:val="left"/>
-            </w:pPr>
-            <w:r/>
-            <w:r>
-              <w:rPr>
-                <w:rFonts w:ascii="Verdana" w:hAnsi="Verdana" w:cs="Verdana" w:eastAsia="Verdana"/>
-                <w:b w:val="0"/>
-                <w:color w:val="1A1A1A"/>
-                <w:sz w:val="15"/>
-              </w:rPr>
-              <w:t>Регламент / схема процесса; обновлённые правила эскалации; меньше потерь на стыках</w:t>
-            </w:r>
-          </w:p>
-        </w:tc>
-        <w:tc>
-          <w:tcPr>
-            <w:tcW w:type="dxa" w:w="4082"/>
-            <w:shd w:val="clear" w:color="auto" w:fill="FFFFFF"/>
-            <w:tcBorders>
-              <w:top w:val="single" w:sz="6" w:space="0" w:color="D0D0D0"/>
-              <w:left w:val="single" w:sz="6" w:space="0" w:color="D0D0D0"/>
-              <w:bottom w:val="single" w:sz="6" w:space="0" w:color="D0D0D0"/>
-              <w:right w:val="single" w:sz="6" w:space="0" w:color="D0D0D0"/>
-            </w:tcBorders>
-            <w:tcMar>
-              <w:top w:w="40" w:type="dxa"/>
-              <w:left w:w="50" w:type="dxa"/>
-              <w:bottom w:w="40" w:type="dxa"/>
-              <w:right w:w="50" w:type="dxa"/>
-            </w:tcMar>
-            <w:vAlign w:val="center"/>
-          </w:tcPr>
-          <w:p>
-            <w:pPr>
-              <w:spacing w:before="0" w:after="0" w:line="264" w:lineRule="auto"/>
-              <w:jc w:val="left"/>
-            </w:pPr>
-            <w:r/>
-            <w:r>
-              <w:rPr>
-                <w:rFonts w:ascii="Verdana" w:hAnsi="Verdana" w:cs="Verdana" w:eastAsia="Verdana"/>
-                <w:b w:val="0"/>
-                <w:color w:val="1A1A1A"/>
-                <w:sz w:val="15"/>
-              </w:rPr>
-              <w:t>Описание текущего as-is; боли МПП; согласование смежных отделов</w:t>
-            </w:r>
-          </w:p>
-        </w:tc>
-      </w:tr>
-      <w:tr>
-        <w:trPr>
-          <w:trHeight w:val="879" w:hRule="atLeast"/>
-        </w:trPr>
-        <w:tc>
-          <w:tcPr>
-            <w:tcW w:type="dxa" w:w="1134"/>
-            <w:shd w:val="clear" w:color="auto" w:fill="FFF8E8"/>
-            <w:tcBorders>
-              <w:top w:val="single" w:sz="6" w:space="0" w:color="D0D0D0"/>
-              <w:left w:val="single" w:sz="6" w:space="0" w:color="D0D0D0"/>
-              <w:bottom w:val="single" w:sz="6" w:space="0" w:color="D0D0D0"/>
-              <w:right w:val="single" w:sz="6" w:space="0" w:color="D0D0D0"/>
-            </w:tcBorders>
-            <w:tcMar>
-              <w:top w:w="40" w:type="dxa"/>
-              <w:left w:w="50" w:type="dxa"/>
-              <w:bottom w:w="40" w:type="dxa"/>
-              <w:right w:w="50" w:type="dxa"/>
-            </w:tcMar>
-            <w:vAlign w:val="center"/>
-          </w:tcPr>
-          <w:p>
-            <w:pPr>
-              <w:spacing w:before="0" w:after="0" w:line="264" w:lineRule="auto"/>
-              <w:jc w:val="center"/>
-            </w:pPr>
-            <w:r/>
-            <w:r>
-              <w:rPr>
-                <w:rFonts w:ascii="Verdana" w:hAnsi="Verdana" w:cs="Verdana" w:eastAsia="Verdana"/>
-                <w:b/>
-                <w:color w:val="1A1A1A"/>
-                <w:sz w:val="18"/>
-              </w:rPr>
-              <w:t>14</w:t>
-            </w:r>
-          </w:p>
-        </w:tc>
-        <w:tc>
-          <w:tcPr>
-            <w:tcW w:type="dxa" w:w="4082"/>
-            <w:shd w:val="clear" w:color="auto" w:fill="FFF8E8"/>
-            <w:tcBorders>
-              <w:top w:val="single" w:sz="6" w:space="0" w:color="D0D0D0"/>
-              <w:left w:val="single" w:sz="6" w:space="0" w:color="D0D0D0"/>
-              <w:bottom w:val="single" w:sz="6" w:space="0" w:color="D0D0D0"/>
-              <w:right w:val="single" w:sz="6" w:space="0" w:color="D0D0D0"/>
-            </w:tcBorders>
-            <w:tcMar>
-              <w:top w:w="40" w:type="dxa"/>
-              <w:left w:w="50" w:type="dxa"/>
-              <w:bottom w:w="40" w:type="dxa"/>
-              <w:right w:w="50" w:type="dxa"/>
-            </w:tcMar>
-            <w:vAlign w:val="center"/>
-          </w:tcPr>
-          <w:p>
-            <w:pPr>
-              <w:spacing w:before="0" w:after="0" w:line="264" w:lineRule="auto"/>
-              <w:jc w:val="left"/>
-            </w:pPr>
-            <w:r/>
-            <w:r>
-              <w:rPr>
-                <w:rFonts w:ascii="Verdana" w:hAnsi="Verdana" w:cs="Verdana" w:eastAsia="Verdana"/>
-                <w:b w:val="0"/>
-                <w:color w:val="1A1A1A"/>
-                <w:sz w:val="15"/>
-              </w:rPr>
-              <w:t>Собственное развитие и передача лучших практик команде</w:t>
-            </w:r>
-          </w:p>
-        </w:tc>
-        <w:tc>
-          <w:tcPr>
-            <w:tcW w:type="dxa" w:w="2041"/>
-            <w:shd w:val="clear" w:color="auto" w:fill="FFF8E8"/>
-            <w:tcBorders>
-              <w:top w:val="single" w:sz="6" w:space="0" w:color="D0D0D0"/>
-              <w:left w:val="single" w:sz="6" w:space="0" w:color="D0D0D0"/>
-              <w:bottom w:val="single" w:sz="6" w:space="0" w:color="D0D0D0"/>
-              <w:right w:val="single" w:sz="6" w:space="0" w:color="D0D0D0"/>
-            </w:tcBorders>
-            <w:tcMar>
-              <w:top w:w="40" w:type="dxa"/>
-              <w:left w:w="50" w:type="dxa"/>
-              <w:bottom w:w="40" w:type="dxa"/>
-              <w:right w:w="50" w:type="dxa"/>
-            </w:tcMar>
-            <w:vAlign w:val="center"/>
-          </w:tcPr>
-          <w:p>
-            <w:pPr>
-              <w:spacing w:before="0" w:after="0" w:line="264" w:lineRule="auto"/>
-              <w:jc w:val="center"/>
-            </w:pPr>
-            <w:r/>
-            <w:r>
-              <w:rPr>
-                <w:rFonts w:ascii="Verdana" w:hAnsi="Verdana" w:cs="Verdana" w:eastAsia="Verdana"/>
-                <w:b w:val="0"/>
-                <w:color w:val="1A1A1A"/>
-                <w:sz w:val="15"/>
-              </w:rPr>
-              <w:t>3 ч / мес (~2%)</w:t>
-            </w:r>
-          </w:p>
-        </w:tc>
-        <w:tc>
-          <w:tcPr>
-            <w:tcW w:type="dxa" w:w="3969"/>
-            <w:shd w:val="clear" w:color="auto" w:fill="FFF8E8"/>
-            <w:tcBorders>
-              <w:top w:val="single" w:sz="6" w:space="0" w:color="D0D0D0"/>
-              <w:left w:val="single" w:sz="6" w:space="0" w:color="D0D0D0"/>
-              <w:bottom w:val="single" w:sz="6" w:space="0" w:color="D0D0D0"/>
-              <w:right w:val="single" w:sz="6" w:space="0" w:color="D0D0D0"/>
-            </w:tcBorders>
-            <w:tcMar>
-              <w:top w:w="40" w:type="dxa"/>
-              <w:left w:w="50" w:type="dxa"/>
-              <w:bottom w:w="40" w:type="dxa"/>
-              <w:right w:w="50" w:type="dxa"/>
-            </w:tcMar>
-            <w:vAlign w:val="center"/>
-          </w:tcPr>
-          <w:p>
-            <w:pPr>
-              <w:spacing w:before="0" w:after="0" w:line="264" w:lineRule="auto"/>
-              <w:jc w:val="left"/>
-            </w:pPr>
-            <w:r/>
-            <w:r>
-              <w:rPr>
-                <w:rFonts w:ascii="Verdana" w:hAnsi="Verdana" w:cs="Verdana" w:eastAsia="Verdana"/>
-                <w:b w:val="0"/>
-                <w:color w:val="1A1A1A"/>
-                <w:sz w:val="15"/>
-              </w:rPr>
-              <w:t>Личный план развития; короткие внутренние практики / памятки для МПП</w:t>
-            </w:r>
-          </w:p>
-        </w:tc>
-        <w:tc>
-          <w:tcPr>
-            <w:tcW w:type="dxa" w:w="4082"/>
-            <w:shd w:val="clear" w:color="auto" w:fill="FFF8E8"/>
-            <w:tcBorders>
-              <w:top w:val="single" w:sz="6" w:space="0" w:color="D0D0D0"/>
-              <w:left w:val="single" w:sz="6" w:space="0" w:color="D0D0D0"/>
-              <w:bottom w:val="single" w:sz="6" w:space="0" w:color="D0D0D0"/>
-              <w:right w:val="single" w:sz="6" w:space="0" w:color="D0D0D0"/>
-            </w:tcBorders>
-            <w:tcMar>
-              <w:top w:w="40" w:type="dxa"/>
-              <w:left w:w="50" w:type="dxa"/>
-              <w:bottom w:w="40" w:type="dxa"/>
-              <w:right w:w="50" w:type="dxa"/>
-            </w:tcMar>
-            <w:vAlign w:val="center"/>
-          </w:tcPr>
-          <w:p>
-            <w:pPr>
-              <w:spacing w:before="0" w:after="0" w:line="264" w:lineRule="auto"/>
-              <w:jc w:val="left"/>
-            </w:pPr>
-            <w:r/>
-            <w:r>
-              <w:rPr>
-                <w:rFonts w:ascii="Verdana" w:hAnsi="Verdana" w:cs="Verdana" w:eastAsia="Verdana"/>
-                <w:b w:val="0"/>
-                <w:color w:val="1A1A1A"/>
-                <w:sz w:val="15"/>
-              </w:rPr>
-              <w:t>Доступ к Корпоративному университету / курсам 1С; база лучших звонков</w:t>
+              <w:t>Доступ к обучению; база кейсов запусков</w:t>
             </w:r>
           </w:p>
         </w:tc>
@@ -3663,7 +3303,7 @@
           <w:color w:val="767677"/>
           <w:sz w:val="16"/>
         </w:rPr>
-        <w:t>Подсветка рангов 1–4: ядро роли — работа с менеджерами (канбаны, качество, обучение, 1-1). Именно эти функции сильнее всего влияют на результат Тимлида.</w:t>
+        <w:t>Подсветка рангов 1–5: фактическое ядро нагрузки — продуктовые стратегии, аналитика базы, финансы, продвижение / маркетинг и встречи со смежными подразделениями по портфелю продуктов.</w:t>
       </w:r>
     </w:p>
     <w:p>
@@ -3694,7 +3334,7 @@
           <w:color w:val="1A1A1A"/>
           <w:sz w:val="19"/>
         </w:rPr>
-        <w:t>4.1. Управление МПП и сделками (приоритет №1)</w:t>
+        <w:t>4.1. Портфель продуктов и стратегия запуска (фактический приоритет №1)</w:t>
       </w:r>
     </w:p>
     <w:p>
@@ -3709,7 +3349,7 @@
           <w:color w:val="1A1A1A"/>
           <w:sz w:val="19"/>
         </w:rPr>
-        <w:t>Ежедневно / еженедельно разбирать канбаны МПП: стадии, зависшие сделки, качество next step.</w:t>
+        <w:t>Параллельно вести 3–5+ продуктов: для каждого — гипотеза, позиционирование, приоритеты и критерии успеха.</w:t>
       </w:r>
     </w:p>
     <w:p>
@@ -3724,7 +3364,7 @@
           <w:color w:val="1A1A1A"/>
           <w:sz w:val="19"/>
         </w:rPr>
-        <w:t>Понимать логику каждой ключевой сделки: ЛПР, потребность, продукт, риск, следующий шаг.</w:t>
+        <w:t>Собирать продуктовую стратегию в решения, которые можно передать МПП и смежным отделам.</w:t>
       </w:r>
     </w:p>
     <w:p>
@@ -3739,7 +3379,21 @@
           <w:color w:val="1A1A1A"/>
           <w:sz w:val="19"/>
         </w:rPr>
-        <w:t>Не подменять собой МПП в типовых звонках; усиливать через разбор, коучинг и контроль стандарта.</w:t>
+        <w:t>Быстро пересобирать оффер / скрипт / приоритеты при изменении рынка или ограничений продукта.</w:t>
+      </w:r>
+    </w:p>
+    <w:p>
+      <w:pPr>
+        <w:spacing w:before="0" w:after="80" w:line="264" w:lineRule="auto"/>
+      </w:pPr>
+      <w:r>
+        <w:rPr>
+          <w:rFonts w:ascii="Verdana" w:hAnsi="Verdana" w:cs="Verdana" w:eastAsia="Verdana"/>
+          <w:b/>
+          <w:color w:val="1A1A1A"/>
+          <w:sz w:val="19"/>
+        </w:rPr>
+        <w:t>4.2. Аналитика базы и финансовая аналитика</w:t>
       </w:r>
     </w:p>
     <w:p>
@@ -3754,21 +3408,7 @@
           <w:color w:val="1A1A1A"/>
           <w:sz w:val="19"/>
         </w:rPr>
-        <w:t>Держать прозрачную картину выполнения плана по каждому менеджеру и по группе.</w:t>
-      </w:r>
-    </w:p>
-    <w:p>
-      <w:pPr>
-        <w:spacing w:before="0" w:after="80" w:line="264" w:lineRule="auto"/>
-      </w:pPr>
-      <w:r>
-        <w:rPr>
-          <w:rFonts w:ascii="Verdana" w:hAnsi="Verdana" w:cs="Verdana" w:eastAsia="Verdana"/>
-          <w:b/>
-          <w:color w:val="1A1A1A"/>
-          <w:sz w:val="19"/>
-        </w:rPr>
-        <w:t>4.2. Продукт, гипотезы и рынок</w:t>
+        <w:t>Регулярно читать базу и воронку: где теряем конверсию, какой сегмент и какой продукт проседают.</w:t>
       </w:r>
     </w:p>
     <w:p>
@@ -3783,7 +3423,7 @@
           <w:color w:val="1A1A1A"/>
           <w:sz w:val="19"/>
         </w:rPr>
-        <w:t>Через практику команды проверять гипотезы запуска и быстро возвращать выводы в оффер / скрипт / продукт.</w:t>
+        <w:t>Сводить CRM-картину с выгрузками УТ / финансов: план-факт, экономика запуска, мотивация, бюджеты.</w:t>
       </w:r>
     </w:p>
     <w:p>
@@ -3798,7 +3438,7 @@
           <w:color w:val="1A1A1A"/>
           <w:sz w:val="19"/>
         </w:rPr>
-        <w:t>Поддерживать актуальные КП, позиционирование и материалы для МПП.</w:t>
+        <w:t>На основе цифр принимать решения по приоритетам обзвона, акциям и ресурсным встречам.</w:t>
       </w:r>
     </w:p>
     <w:p>
@@ -3812,7 +3452,7 @@
           <w:color w:val="1A1A1A"/>
           <w:sz w:val="19"/>
         </w:rPr>
-        <w:t>4.3. Стыки, финансы и обеспеченность процесса</w:t>
+        <w:t>4.3. Продвижение, маркетинг и кросс-функциональные встречи</w:t>
       </w:r>
     </w:p>
     <w:p>
@@ -3827,7 +3467,7 @@
           <w:color w:val="1A1A1A"/>
           <w:sz w:val="19"/>
         </w:rPr>
-        <w:t>Синхронизировать маркетинг, продукт / ЦРП, поддержку и финблок так, чтобы МПП не теряли скорость.</w:t>
+        <w:t>Инициировать и сопровождать мероприятия / акции по продвижению сервисов и маркетинговые стратегии запусков.</w:t>
       </w:r>
     </w:p>
     <w:p>
@@ -3842,7 +3482,81 @@
           <w:color w:val="1A1A1A"/>
           <w:sz w:val="19"/>
         </w:rPr>
-        <w:t>Для финконтроля и мотивации использовать выгрузки продаж из УТ, данные CRM и утверждённые правила KPI.</w:t>
+        <w:t>Проводить большое число встреч со смежными подразделениями по продуктам портфеля и фиксировать договорённости.</w:t>
+      </w:r>
+    </w:p>
+    <w:p>
+      <w:pPr>
+        <w:pStyle w:val="ListBullet"/>
+        <w:spacing w:before="0" w:after="40" w:line="264" w:lineRule="auto"/>
+      </w:pPr>
+      <w:r>
+        <w:rPr>
+          <w:rFonts w:ascii="Verdana" w:hAnsi="Verdana" w:cs="Verdana" w:eastAsia="Verdana"/>
+          <w:b w:val="0"/>
+          <w:color w:val="1A1A1A"/>
+          <w:sz w:val="19"/>
+        </w:rPr>
+        <w:t>Не допускать, чтобы МПП работали с устаревшим статусом продукта, оффера или ограничений.</w:t>
+      </w:r>
+    </w:p>
+    <w:p>
+      <w:pPr>
+        <w:spacing w:before="0" w:after="80" w:line="264" w:lineRule="auto"/>
+      </w:pPr>
+      <w:r>
+        <w:rPr>
+          <w:rFonts w:ascii="Verdana" w:hAnsi="Verdana" w:cs="Verdana" w:eastAsia="Verdana"/>
+          <w:b/>
+          <w:color w:val="1A1A1A"/>
+          <w:sz w:val="19"/>
+        </w:rPr>
+        <w:t>4.4. Управление МПП (обязательный контур внутри продуктовой нагрузки)</w:t>
+      </w:r>
+    </w:p>
+    <w:p>
+      <w:pPr>
+        <w:pStyle w:val="ListBullet"/>
+        <w:spacing w:before="0" w:after="40" w:line="264" w:lineRule="auto"/>
+      </w:pPr>
+      <w:r>
+        <w:rPr>
+          <w:rFonts w:ascii="Verdana" w:hAnsi="Verdana" w:cs="Verdana" w:eastAsia="Verdana"/>
+          <w:b w:val="0"/>
+          <w:color w:val="1A1A1A"/>
+          <w:sz w:val="19"/>
+        </w:rPr>
+        <w:t>Держать контроль канбанов и ключевых сделок, особенно по приоритетным продуктам портфеля.</w:t>
+      </w:r>
+    </w:p>
+    <w:p>
+      <w:pPr>
+        <w:pStyle w:val="ListBullet"/>
+        <w:spacing w:before="0" w:after="40" w:line="264" w:lineRule="auto"/>
+      </w:pPr>
+      <w:r>
+        <w:rPr>
+          <w:rFonts w:ascii="Verdana" w:hAnsi="Verdana" w:cs="Verdana" w:eastAsia="Verdana"/>
+          <w:b w:val="0"/>
+          <w:color w:val="1A1A1A"/>
+          <w:sz w:val="19"/>
+        </w:rPr>
+        <w:t>Коротко обучать МПП изменениям продуктов / акций и сохранять стандарт качества.</w:t>
+      </w:r>
+    </w:p>
+    <w:p>
+      <w:pPr>
+        <w:pStyle w:val="ListBullet"/>
+        <w:spacing w:before="0" w:after="40" w:line="264" w:lineRule="auto"/>
+      </w:pPr>
+      <w:r>
+        <w:rPr>
+          <w:rFonts w:ascii="Verdana" w:hAnsi="Verdana" w:cs="Verdana" w:eastAsia="Verdana"/>
+          <w:b w:val="0"/>
+          <w:color w:val="1A1A1A"/>
+          <w:sz w:val="19"/>
+        </w:rPr>
+        <w:t>По возможности увеличивать долю времени на работу с МПП — это ускоряет проверку стратегий на рынке.</w:t>
       </w:r>
     </w:p>
     <w:p>
@@ -3975,7 +3689,7 @@
                 <w:color w:val="1A1A1A"/>
                 <w:sz w:val="16"/>
               </w:rPr>
-              <w:t>Управление МПП через канбан и сделки</w:t>
+              <w:t>Управление портфелем 3–5+ продуктов и продуктовые стратегии</w:t>
             </w:r>
           </w:p>
         </w:tc>
@@ -4010,7 +3724,7 @@
                 <w:color w:val="1A1A1A"/>
                 <w:sz w:val="16"/>
               </w:rPr>
-              <w:t>Свободно читает воронку, видит риски, ставит точные next steps</w:t>
+              <w:t>Параллельно ведёт несколько запусков и собирает приоритеты в решения</w:t>
             </w:r>
           </w:p>
         </w:tc>
@@ -4047,7 +3761,7 @@
                 <w:color w:val="1A1A1A"/>
                 <w:sz w:val="16"/>
               </w:rPr>
-              <w:t>Коучинг и контроль стандартов продаж</w:t>
+              <w:t>Аналитика базы и воронки</w:t>
             </w:r>
           </w:p>
         </w:tc>
@@ -4082,7 +3796,7 @@
                 <w:color w:val="1A1A1A"/>
                 <w:sz w:val="16"/>
               </w:rPr>
-              <w:t>Системно разбирает звонки и удерживает скрипт в команде</w:t>
+              <w:t>Видит сегменты, конверсии и узкие места; переводит выводы в действия</w:t>
             </w:r>
           </w:p>
         </w:tc>
@@ -4119,7 +3833,7 @@
                 <w:color w:val="1A1A1A"/>
                 <w:sz w:val="16"/>
               </w:rPr>
-              <w:t>Обучение продуктам и вывод МПП на новый оффер</w:t>
+              <w:t>Финансовая аналитика запусков</w:t>
             </w:r>
           </w:p>
         </w:tc>
@@ -4154,7 +3868,7 @@
                 <w:color w:val="1A1A1A"/>
                 <w:sz w:val="16"/>
               </w:rPr>
-              <w:t>Готовит материалы и доводит до уверенной практики</w:t>
+              <w:t>Сводит УТ / план-факт / мотивацию / бюджеты в управленческие решения</w:t>
             </w:r>
           </w:p>
         </w:tc>
@@ -4191,7 +3905,7 @@
                 <w:color w:val="1A1A1A"/>
                 <w:sz w:val="16"/>
               </w:rPr>
-              <w:t>Продуктовые гипотезы и адаптация оффера</w:t>
+              <w:t>Маркетинг и мероприятия продвижения сервисов</w:t>
             </w:r>
           </w:p>
         </w:tc>
@@ -4226,7 +3940,7 @@
                 <w:color w:val="1A1A1A"/>
                 <w:sz w:val="16"/>
               </w:rPr>
-              <w:t>Переводит рынок в решения по продукту / скрипту / КП</w:t>
+              <w:t>Запускает активности и оценивает эффект на базу и сделки</w:t>
             </w:r>
           </w:p>
         </w:tc>
@@ -4263,7 +3977,7 @@
                 <w:color w:val="1A1A1A"/>
                 <w:sz w:val="16"/>
               </w:rPr>
-              <w:t>Взаимодействие со смежными отделами</w:t>
+              <w:t>Кросс-функциональные встречи по продуктам</w:t>
             </w:r>
           </w:p>
         </w:tc>
@@ -4298,7 +4012,7 @@
                 <w:color w:val="1A1A1A"/>
                 <w:sz w:val="16"/>
               </w:rPr>
-              <w:t>Закрывает стыки без потери скорости команды</w:t>
+              <w:t>Синхронизирует много стейкхолдеров без потери статуса для команды</w:t>
             </w:r>
           </w:p>
         </w:tc>
@@ -4335,7 +4049,7 @@
                 <w:color w:val="1A1A1A"/>
                 <w:sz w:val="16"/>
               </w:rPr>
-              <w:t>Финансовый и операционный контроль</w:t>
+              <w:t>Управление МПП через канбан / сделки / короткое обучение</w:t>
             </w:r>
           </w:p>
         </w:tc>
@@ -4370,7 +4084,7 @@
                 <w:color w:val="1A1A1A"/>
                 <w:sz w:val="16"/>
               </w:rPr>
-              <w:t>Сводит план, УТ, CRM и мотивацию в управляемые решения</w:t>
+              <w:t>Удерживает исполнение стратегии руками команды на рынке</w:t>
             </w:r>
           </w:p>
         </w:tc>
@@ -4497,7 +4211,22 @@
           <w:color w:val="1A1A1A"/>
           <w:sz w:val="19"/>
         </w:rPr>
-        <w:t>За приоритет работы с МПП и качество управления их сделками / канбанами.</w:t>
+        <w:t>За качество управления портфелем продуктов (3–5+) и связанных продуктовых / маркетинговых / финансовых решений.</w:t>
+      </w:r>
+    </w:p>
+    <w:p>
+      <w:pPr>
+        <w:pStyle w:val="ListBullet"/>
+        <w:spacing w:before="0" w:after="40" w:line="264" w:lineRule="auto"/>
+      </w:pPr>
+      <w:r>
+        <w:rPr>
+          <w:rFonts w:ascii="Verdana" w:hAnsi="Verdana" w:cs="Verdana" w:eastAsia="Verdana"/>
+          <w:b w:val="0"/>
+          <w:color w:val="1A1A1A"/>
+          <w:sz w:val="19"/>
+        </w:rPr>
+        <w:t>За качество управления МПП в части канбанов, ключевых сделок и готовности команды к изменениям продуктов.</w:t>
       </w:r>
     </w:p>
     <w:p>
@@ -4705,6 +4434,294 @@
                 <w:color w:val="1A1A1A"/>
                 <w:sz w:val="16"/>
               </w:rPr>
+              <w:t>Продуктовая разработка / ЦРП</w:t>
+            </w:r>
+          </w:p>
+        </w:tc>
+        <w:tc>
+          <w:tcPr>
+            <w:tcW w:type="dxa" w:w="11339"/>
+            <w:shd w:val="clear" w:color="auto" w:fill="FFFFFF"/>
+            <w:tcBorders>
+              <w:top w:val="single" w:sz="6" w:space="0" w:color="D0D0D0"/>
+              <w:left w:val="single" w:sz="6" w:space="0" w:color="D0D0D0"/>
+              <w:bottom w:val="single" w:sz="6" w:space="0" w:color="D0D0D0"/>
+              <w:right w:val="single" w:sz="6" w:space="0" w:color="D0D0D0"/>
+            </w:tcBorders>
+            <w:tcMar>
+              <w:top w:w="40" w:type="dxa"/>
+              <w:left w:w="50" w:type="dxa"/>
+              <w:bottom w:w="40" w:type="dxa"/>
+              <w:right w:w="50" w:type="dxa"/>
+            </w:tcMar>
+            <w:vAlign w:val="center"/>
+          </w:tcPr>
+          <w:p>
+            <w:pPr>
+              <w:spacing w:before="0" w:after="0" w:line="264" w:lineRule="auto"/>
+              <w:jc w:val="left"/>
+            </w:pPr>
+            <w:r/>
+            <w:r>
+              <w:rPr>
+                <w:rFonts w:ascii="Verdana" w:hAnsi="Verdana" w:cs="Verdana" w:eastAsia="Verdana"/>
+                <w:b w:val="0"/>
+                <w:color w:val="1A1A1A"/>
+                <w:sz w:val="16"/>
+              </w:rPr>
+              <w:t>Стратегии продуктов портфеля, ограничения, доработки, партнёрский канал</w:t>
+            </w:r>
+          </w:p>
+        </w:tc>
+      </w:tr>
+      <w:tr>
+        <w:tc>
+          <w:tcPr>
+            <w:tcW w:type="dxa" w:w="3969"/>
+            <w:shd w:val="clear" w:color="auto" w:fill="FFF8E8"/>
+            <w:tcBorders>
+              <w:top w:val="single" w:sz="6" w:space="0" w:color="D0D0D0"/>
+              <w:left w:val="single" w:sz="6" w:space="0" w:color="D0D0D0"/>
+              <w:bottom w:val="single" w:sz="6" w:space="0" w:color="D0D0D0"/>
+              <w:right w:val="single" w:sz="6" w:space="0" w:color="D0D0D0"/>
+            </w:tcBorders>
+            <w:tcMar>
+              <w:top w:w="40" w:type="dxa"/>
+              <w:left w:w="50" w:type="dxa"/>
+              <w:bottom w:w="40" w:type="dxa"/>
+              <w:right w:w="50" w:type="dxa"/>
+            </w:tcMar>
+            <w:vAlign w:val="center"/>
+          </w:tcPr>
+          <w:p>
+            <w:pPr>
+              <w:spacing w:before="0" w:after="0" w:line="264" w:lineRule="auto"/>
+              <w:jc w:val="left"/>
+            </w:pPr>
+            <w:r/>
+            <w:r>
+              <w:rPr>
+                <w:rFonts w:ascii="Verdana" w:hAnsi="Verdana" w:cs="Verdana" w:eastAsia="Verdana"/>
+                <w:b/>
+                <w:color w:val="1A1A1A"/>
+                <w:sz w:val="16"/>
+              </w:rPr>
+              <w:t>Маркетинг</w:t>
+            </w:r>
+          </w:p>
+        </w:tc>
+        <w:tc>
+          <w:tcPr>
+            <w:tcW w:type="dxa" w:w="11339"/>
+            <w:shd w:val="clear" w:color="auto" w:fill="FFF8E8"/>
+            <w:tcBorders>
+              <w:top w:val="single" w:sz="6" w:space="0" w:color="D0D0D0"/>
+              <w:left w:val="single" w:sz="6" w:space="0" w:color="D0D0D0"/>
+              <w:bottom w:val="single" w:sz="6" w:space="0" w:color="D0D0D0"/>
+              <w:right w:val="single" w:sz="6" w:space="0" w:color="D0D0D0"/>
+            </w:tcBorders>
+            <w:tcMar>
+              <w:top w:w="40" w:type="dxa"/>
+              <w:left w:w="50" w:type="dxa"/>
+              <w:bottom w:w="40" w:type="dxa"/>
+              <w:right w:w="50" w:type="dxa"/>
+            </w:tcMar>
+            <w:vAlign w:val="center"/>
+          </w:tcPr>
+          <w:p>
+            <w:pPr>
+              <w:spacing w:before="0" w:after="0" w:line="264" w:lineRule="auto"/>
+              <w:jc w:val="left"/>
+            </w:pPr>
+            <w:r/>
+            <w:r>
+              <w:rPr>
+                <w:rFonts w:ascii="Verdana" w:hAnsi="Verdana" w:cs="Verdana" w:eastAsia="Verdana"/>
+                <w:b w:val="0"/>
+                <w:color w:val="1A1A1A"/>
+                <w:sz w:val="16"/>
+              </w:rPr>
+              <w:t>Мероприятия продвижения, акции, материалы, сегментные кампании, эффект на базу</w:t>
+            </w:r>
+          </w:p>
+        </w:tc>
+      </w:tr>
+      <w:tr>
+        <w:tc>
+          <w:tcPr>
+            <w:tcW w:type="dxa" w:w="3969"/>
+            <w:shd w:val="clear" w:color="auto" w:fill="FFFFFF"/>
+            <w:tcBorders>
+              <w:top w:val="single" w:sz="6" w:space="0" w:color="D0D0D0"/>
+              <w:left w:val="single" w:sz="6" w:space="0" w:color="D0D0D0"/>
+              <w:bottom w:val="single" w:sz="6" w:space="0" w:color="D0D0D0"/>
+              <w:right w:val="single" w:sz="6" w:space="0" w:color="D0D0D0"/>
+            </w:tcBorders>
+            <w:tcMar>
+              <w:top w:w="40" w:type="dxa"/>
+              <w:left w:w="50" w:type="dxa"/>
+              <w:bottom w:w="40" w:type="dxa"/>
+              <w:right w:w="50" w:type="dxa"/>
+            </w:tcMar>
+            <w:vAlign w:val="center"/>
+          </w:tcPr>
+          <w:p>
+            <w:pPr>
+              <w:spacing w:before="0" w:after="0" w:line="264" w:lineRule="auto"/>
+              <w:jc w:val="left"/>
+            </w:pPr>
+            <w:r/>
+            <w:r>
+              <w:rPr>
+                <w:rFonts w:ascii="Verdana" w:hAnsi="Verdana" w:cs="Verdana" w:eastAsia="Verdana"/>
+                <w:b/>
+                <w:color w:val="1A1A1A"/>
+                <w:sz w:val="16"/>
+              </w:rPr>
+              <w:t>Финансовая аналитика / УТ</w:t>
+            </w:r>
+          </w:p>
+        </w:tc>
+        <w:tc>
+          <w:tcPr>
+            <w:tcW w:type="dxa" w:w="11339"/>
+            <w:shd w:val="clear" w:color="auto" w:fill="FFFFFF"/>
+            <w:tcBorders>
+              <w:top w:val="single" w:sz="6" w:space="0" w:color="D0D0D0"/>
+              <w:left w:val="single" w:sz="6" w:space="0" w:color="D0D0D0"/>
+              <w:bottom w:val="single" w:sz="6" w:space="0" w:color="D0D0D0"/>
+              <w:right w:val="single" w:sz="6" w:space="0" w:color="D0D0D0"/>
+            </w:tcBorders>
+            <w:tcMar>
+              <w:top w:w="40" w:type="dxa"/>
+              <w:left w:w="50" w:type="dxa"/>
+              <w:bottom w:w="40" w:type="dxa"/>
+              <w:right w:w="50" w:type="dxa"/>
+            </w:tcMar>
+            <w:vAlign w:val="center"/>
+          </w:tcPr>
+          <w:p>
+            <w:pPr>
+              <w:spacing w:before="0" w:after="0" w:line="264" w:lineRule="auto"/>
+              <w:jc w:val="left"/>
+            </w:pPr>
+            <w:r/>
+            <w:r>
+              <w:rPr>
+                <w:rFonts w:ascii="Verdana" w:hAnsi="Verdana" w:cs="Verdana" w:eastAsia="Verdana"/>
+                <w:b w:val="0"/>
+                <w:color w:val="1A1A1A"/>
+                <w:sz w:val="16"/>
+              </w:rPr>
+              <w:t>Выгрузки продаж, план-факт, бюджеты, мотивация, экономика запусков</w:t>
+            </w:r>
+          </w:p>
+        </w:tc>
+      </w:tr>
+      <w:tr>
+        <w:tc>
+          <w:tcPr>
+            <w:tcW w:type="dxa" w:w="3969"/>
+            <w:shd w:val="clear" w:color="auto" w:fill="FFF8E8"/>
+            <w:tcBorders>
+              <w:top w:val="single" w:sz="6" w:space="0" w:color="D0D0D0"/>
+              <w:left w:val="single" w:sz="6" w:space="0" w:color="D0D0D0"/>
+              <w:bottom w:val="single" w:sz="6" w:space="0" w:color="D0D0D0"/>
+              <w:right w:val="single" w:sz="6" w:space="0" w:color="D0D0D0"/>
+            </w:tcBorders>
+            <w:tcMar>
+              <w:top w:w="40" w:type="dxa"/>
+              <w:left w:w="50" w:type="dxa"/>
+              <w:bottom w:w="40" w:type="dxa"/>
+              <w:right w:w="50" w:type="dxa"/>
+            </w:tcMar>
+            <w:vAlign w:val="center"/>
+          </w:tcPr>
+          <w:p>
+            <w:pPr>
+              <w:spacing w:before="0" w:after="0" w:line="264" w:lineRule="auto"/>
+              <w:jc w:val="left"/>
+            </w:pPr>
+            <w:r/>
+            <w:r>
+              <w:rPr>
+                <w:rFonts w:ascii="Verdana" w:hAnsi="Verdana" w:cs="Verdana" w:eastAsia="Verdana"/>
+                <w:b/>
+                <w:color w:val="1A1A1A"/>
+                <w:sz w:val="16"/>
+              </w:rPr>
+              <w:t>Смежные подразделения по продуктам</w:t>
+            </w:r>
+          </w:p>
+        </w:tc>
+        <w:tc>
+          <w:tcPr>
+            <w:tcW w:type="dxa" w:w="11339"/>
+            <w:shd w:val="clear" w:color="auto" w:fill="FFF8E8"/>
+            <w:tcBorders>
+              <w:top w:val="single" w:sz="6" w:space="0" w:color="D0D0D0"/>
+              <w:left w:val="single" w:sz="6" w:space="0" w:color="D0D0D0"/>
+              <w:bottom w:val="single" w:sz="6" w:space="0" w:color="D0D0D0"/>
+              <w:right w:val="single" w:sz="6" w:space="0" w:color="D0D0D0"/>
+            </w:tcBorders>
+            <w:tcMar>
+              <w:top w:w="40" w:type="dxa"/>
+              <w:left w:w="50" w:type="dxa"/>
+              <w:bottom w:w="40" w:type="dxa"/>
+              <w:right w:w="50" w:type="dxa"/>
+            </w:tcMar>
+            <w:vAlign w:val="center"/>
+          </w:tcPr>
+          <w:p>
+            <w:pPr>
+              <w:spacing w:before="0" w:after="0" w:line="264" w:lineRule="auto"/>
+              <w:jc w:val="left"/>
+            </w:pPr>
+            <w:r/>
+            <w:r>
+              <w:rPr>
+                <w:rFonts w:ascii="Verdana" w:hAnsi="Verdana" w:cs="Verdana" w:eastAsia="Verdana"/>
+                <w:b w:val="0"/>
+                <w:color w:val="1A1A1A"/>
+                <w:sz w:val="16"/>
+              </w:rPr>
+              <w:t>Большой поток встреч: статусы, согласования, эскалации по 3–5+ продуктам</w:t>
+            </w:r>
+          </w:p>
+        </w:tc>
+      </w:tr>
+      <w:tr>
+        <w:tc>
+          <w:tcPr>
+            <w:tcW w:type="dxa" w:w="3969"/>
+            <w:shd w:val="clear" w:color="auto" w:fill="FFFFFF"/>
+            <w:tcBorders>
+              <w:top w:val="single" w:sz="6" w:space="0" w:color="D0D0D0"/>
+              <w:left w:val="single" w:sz="6" w:space="0" w:color="D0D0D0"/>
+              <w:bottom w:val="single" w:sz="6" w:space="0" w:color="D0D0D0"/>
+              <w:right w:val="single" w:sz="6" w:space="0" w:color="D0D0D0"/>
+            </w:tcBorders>
+            <w:tcMar>
+              <w:top w:w="40" w:type="dxa"/>
+              <w:left w:w="50" w:type="dxa"/>
+              <w:bottom w:w="40" w:type="dxa"/>
+              <w:right w:w="50" w:type="dxa"/>
+            </w:tcMar>
+            <w:vAlign w:val="center"/>
+          </w:tcPr>
+          <w:p>
+            <w:pPr>
+              <w:spacing w:before="0" w:after="0" w:line="264" w:lineRule="auto"/>
+              <w:jc w:val="left"/>
+            </w:pPr>
+            <w:r/>
+            <w:r>
+              <w:rPr>
+                <w:rFonts w:ascii="Verdana" w:hAnsi="Verdana" w:cs="Verdana" w:eastAsia="Verdana"/>
+                <w:b/>
+                <w:color w:val="1A1A1A"/>
+                <w:sz w:val="16"/>
+              </w:rPr>
               <w:t>МПП группы</w:t>
             </w:r>
           </w:p>
@@ -4740,7 +4757,7 @@
                 <w:color w:val="1A1A1A"/>
                 <w:sz w:val="16"/>
               </w:rPr>
-              <w:t>Канбаны, сделки, обучение, качество, мотивация, разбор кейсов — основной фокус времени</w:t>
+              <w:t>Канбаны, ключевые сделки, короткое обучение под изменения продуктов / акций</w:t>
             </w:r>
           </w:p>
         </w:tc>
@@ -4812,295 +4829,7 @@
                 <w:color w:val="1A1A1A"/>
                 <w:sz w:val="16"/>
               </w:rPr>
-              <w:t>Цели, приоритеты запусков, KPI, эскалации, кадровые решения</w:t>
-            </w:r>
-          </w:p>
-        </w:tc>
-      </w:tr>
-      <w:tr>
-        <w:tc>
-          <w:tcPr>
-            <w:tcW w:type="dxa" w:w="3969"/>
-            <w:shd w:val="clear" w:color="auto" w:fill="FFFFFF"/>
-            <w:tcBorders>
-              <w:top w:val="single" w:sz="6" w:space="0" w:color="D0D0D0"/>
-              <w:left w:val="single" w:sz="6" w:space="0" w:color="D0D0D0"/>
-              <w:bottom w:val="single" w:sz="6" w:space="0" w:color="D0D0D0"/>
-              <w:right w:val="single" w:sz="6" w:space="0" w:color="D0D0D0"/>
-            </w:tcBorders>
-            <w:tcMar>
-              <w:top w:w="40" w:type="dxa"/>
-              <w:left w:w="50" w:type="dxa"/>
-              <w:bottom w:w="40" w:type="dxa"/>
-              <w:right w:w="50" w:type="dxa"/>
-            </w:tcMar>
-            <w:vAlign w:val="center"/>
-          </w:tcPr>
-          <w:p>
-            <w:pPr>
-              <w:spacing w:before="0" w:after="0" w:line="264" w:lineRule="auto"/>
-              <w:jc w:val="left"/>
-            </w:pPr>
-            <w:r/>
-            <w:r>
-              <w:rPr>
-                <w:rFonts w:ascii="Verdana" w:hAnsi="Verdana" w:cs="Verdana" w:eastAsia="Verdana"/>
-                <w:b/>
-                <w:color w:val="1A1A1A"/>
-                <w:sz w:val="16"/>
-              </w:rPr>
-              <w:t>Маркетинг</w:t>
-            </w:r>
-          </w:p>
-        </w:tc>
-        <w:tc>
-          <w:tcPr>
-            <w:tcW w:type="dxa" w:w="11339"/>
-            <w:shd w:val="clear" w:color="auto" w:fill="FFFFFF"/>
-            <w:tcBorders>
-              <w:top w:val="single" w:sz="6" w:space="0" w:color="D0D0D0"/>
-              <w:left w:val="single" w:sz="6" w:space="0" w:color="D0D0D0"/>
-              <w:bottom w:val="single" w:sz="6" w:space="0" w:color="D0D0D0"/>
-              <w:right w:val="single" w:sz="6" w:space="0" w:color="D0D0D0"/>
-            </w:tcBorders>
-            <w:tcMar>
-              <w:top w:w="40" w:type="dxa"/>
-              <w:left w:w="50" w:type="dxa"/>
-              <w:bottom w:w="40" w:type="dxa"/>
-              <w:right w:w="50" w:type="dxa"/>
-            </w:tcMar>
-            <w:vAlign w:val="center"/>
-          </w:tcPr>
-          <w:p>
-            <w:pPr>
-              <w:spacing w:before="0" w:after="0" w:line="264" w:lineRule="auto"/>
-              <w:jc w:val="left"/>
-            </w:pPr>
-            <w:r/>
-            <w:r>
-              <w:rPr>
-                <w:rFonts w:ascii="Verdana" w:hAnsi="Verdana" w:cs="Verdana" w:eastAsia="Verdana"/>
-                <w:b w:val="0"/>
-                <w:color w:val="1A1A1A"/>
-                <w:sz w:val="16"/>
-              </w:rPr>
-              <w:t>Гипотезы, материалы, рекламные активности, сегментные кампании</w:t>
-            </w:r>
-          </w:p>
-        </w:tc>
-      </w:tr>
-      <w:tr>
-        <w:tc>
-          <w:tcPr>
-            <w:tcW w:type="dxa" w:w="3969"/>
-            <w:shd w:val="clear" w:color="auto" w:fill="FFF8E8"/>
-            <w:tcBorders>
-              <w:top w:val="single" w:sz="6" w:space="0" w:color="D0D0D0"/>
-              <w:left w:val="single" w:sz="6" w:space="0" w:color="D0D0D0"/>
-              <w:bottom w:val="single" w:sz="6" w:space="0" w:color="D0D0D0"/>
-              <w:right w:val="single" w:sz="6" w:space="0" w:color="D0D0D0"/>
-            </w:tcBorders>
-            <w:tcMar>
-              <w:top w:w="40" w:type="dxa"/>
-              <w:left w:w="50" w:type="dxa"/>
-              <w:bottom w:w="40" w:type="dxa"/>
-              <w:right w:w="50" w:type="dxa"/>
-            </w:tcMar>
-            <w:vAlign w:val="center"/>
-          </w:tcPr>
-          <w:p>
-            <w:pPr>
-              <w:spacing w:before="0" w:after="0" w:line="264" w:lineRule="auto"/>
-              <w:jc w:val="left"/>
-            </w:pPr>
-            <w:r/>
-            <w:r>
-              <w:rPr>
-                <w:rFonts w:ascii="Verdana" w:hAnsi="Verdana" w:cs="Verdana" w:eastAsia="Verdana"/>
-                <w:b/>
-                <w:color w:val="1A1A1A"/>
-                <w:sz w:val="16"/>
-              </w:rPr>
-              <w:t>Продуктовая разработка / ЦРП</w:t>
-            </w:r>
-          </w:p>
-        </w:tc>
-        <w:tc>
-          <w:tcPr>
-            <w:tcW w:type="dxa" w:w="11339"/>
-            <w:shd w:val="clear" w:color="auto" w:fill="FFF8E8"/>
-            <w:tcBorders>
-              <w:top w:val="single" w:sz="6" w:space="0" w:color="D0D0D0"/>
-              <w:left w:val="single" w:sz="6" w:space="0" w:color="D0D0D0"/>
-              <w:bottom w:val="single" w:sz="6" w:space="0" w:color="D0D0D0"/>
-              <w:right w:val="single" w:sz="6" w:space="0" w:color="D0D0D0"/>
-            </w:tcBorders>
-            <w:tcMar>
-              <w:top w:w="40" w:type="dxa"/>
-              <w:left w:w="50" w:type="dxa"/>
-              <w:bottom w:w="40" w:type="dxa"/>
-              <w:right w:w="50" w:type="dxa"/>
-            </w:tcMar>
-            <w:vAlign w:val="center"/>
-          </w:tcPr>
-          <w:p>
-            <w:pPr>
-              <w:spacing w:before="0" w:after="0" w:line="264" w:lineRule="auto"/>
-              <w:jc w:val="left"/>
-            </w:pPr>
-            <w:r/>
-            <w:r>
-              <w:rPr>
-                <w:rFonts w:ascii="Verdana" w:hAnsi="Verdana" w:cs="Verdana" w:eastAsia="Verdana"/>
-                <w:b w:val="0"/>
-                <w:color w:val="1A1A1A"/>
-                <w:sz w:val="16"/>
-              </w:rPr>
-              <w:t>Требования к продукту, ограничения, партнёрская сеть, доработки</w:t>
-            </w:r>
-          </w:p>
-        </w:tc>
-      </w:tr>
-      <w:tr>
-        <w:tc>
-          <w:tcPr>
-            <w:tcW w:type="dxa" w:w="3969"/>
-            <w:shd w:val="clear" w:color="auto" w:fill="FFFFFF"/>
-            <w:tcBorders>
-              <w:top w:val="single" w:sz="6" w:space="0" w:color="D0D0D0"/>
-              <w:left w:val="single" w:sz="6" w:space="0" w:color="D0D0D0"/>
-              <w:bottom w:val="single" w:sz="6" w:space="0" w:color="D0D0D0"/>
-              <w:right w:val="single" w:sz="6" w:space="0" w:color="D0D0D0"/>
-            </w:tcBorders>
-            <w:tcMar>
-              <w:top w:w="40" w:type="dxa"/>
-              <w:left w:w="50" w:type="dxa"/>
-              <w:bottom w:w="40" w:type="dxa"/>
-              <w:right w:w="50" w:type="dxa"/>
-            </w:tcMar>
-            <w:vAlign w:val="center"/>
-          </w:tcPr>
-          <w:p>
-            <w:pPr>
-              <w:spacing w:before="0" w:after="0" w:line="264" w:lineRule="auto"/>
-              <w:jc w:val="left"/>
-            </w:pPr>
-            <w:r/>
-            <w:r>
-              <w:rPr>
-                <w:rFonts w:ascii="Verdana" w:hAnsi="Verdana" w:cs="Verdana" w:eastAsia="Verdana"/>
-                <w:b/>
-                <w:color w:val="1A1A1A"/>
-                <w:sz w:val="16"/>
-              </w:rPr>
-              <w:t>Финансовая аналитика / УТ</w:t>
-            </w:r>
-          </w:p>
-        </w:tc>
-        <w:tc>
-          <w:tcPr>
-            <w:tcW w:type="dxa" w:w="11339"/>
-            <w:shd w:val="clear" w:color="auto" w:fill="FFFFFF"/>
-            <w:tcBorders>
-              <w:top w:val="single" w:sz="6" w:space="0" w:color="D0D0D0"/>
-              <w:left w:val="single" w:sz="6" w:space="0" w:color="D0D0D0"/>
-              <w:bottom w:val="single" w:sz="6" w:space="0" w:color="D0D0D0"/>
-              <w:right w:val="single" w:sz="6" w:space="0" w:color="D0D0D0"/>
-            </w:tcBorders>
-            <w:tcMar>
-              <w:top w:w="40" w:type="dxa"/>
-              <w:left w:w="50" w:type="dxa"/>
-              <w:bottom w:w="40" w:type="dxa"/>
-              <w:right w:w="50" w:type="dxa"/>
-            </w:tcMar>
-            <w:vAlign w:val="center"/>
-          </w:tcPr>
-          <w:p>
-            <w:pPr>
-              <w:spacing w:before="0" w:after="0" w:line="264" w:lineRule="auto"/>
-              <w:jc w:val="left"/>
-            </w:pPr>
-            <w:r/>
-            <w:r>
-              <w:rPr>
-                <w:rFonts w:ascii="Verdana" w:hAnsi="Verdana" w:cs="Verdana" w:eastAsia="Verdana"/>
-                <w:b w:val="0"/>
-                <w:color w:val="1A1A1A"/>
-                <w:sz w:val="16"/>
-              </w:rPr>
-              <w:t>Выгрузки продаж, финпланы, бюджеты, мотивация, сверка факта</w:t>
-            </w:r>
-          </w:p>
-        </w:tc>
-      </w:tr>
-      <w:tr>
-        <w:tc>
-          <w:tcPr>
-            <w:tcW w:type="dxa" w:w="3969"/>
-            <w:shd w:val="clear" w:color="auto" w:fill="FFF8E8"/>
-            <w:tcBorders>
-              <w:top w:val="single" w:sz="6" w:space="0" w:color="D0D0D0"/>
-              <w:left w:val="single" w:sz="6" w:space="0" w:color="D0D0D0"/>
-              <w:bottom w:val="single" w:sz="6" w:space="0" w:color="D0D0D0"/>
-              <w:right w:val="single" w:sz="6" w:space="0" w:color="D0D0D0"/>
-            </w:tcBorders>
-            <w:tcMar>
-              <w:top w:w="40" w:type="dxa"/>
-              <w:left w:w="50" w:type="dxa"/>
-              <w:bottom w:w="40" w:type="dxa"/>
-              <w:right w:w="50" w:type="dxa"/>
-            </w:tcMar>
-            <w:vAlign w:val="center"/>
-          </w:tcPr>
-          <w:p>
-            <w:pPr>
-              <w:spacing w:before="0" w:after="0" w:line="264" w:lineRule="auto"/>
-              <w:jc w:val="left"/>
-            </w:pPr>
-            <w:r/>
-            <w:r>
-              <w:rPr>
-                <w:rFonts w:ascii="Verdana" w:hAnsi="Verdana" w:cs="Verdana" w:eastAsia="Verdana"/>
-                <w:b/>
-                <w:color w:val="1A1A1A"/>
-                <w:sz w:val="16"/>
-              </w:rPr>
-              <w:t>Смежные продажи / поддержка</w:t>
-            </w:r>
-          </w:p>
-        </w:tc>
-        <w:tc>
-          <w:tcPr>
-            <w:tcW w:type="dxa" w:w="11339"/>
-            <w:shd w:val="clear" w:color="auto" w:fill="FFF8E8"/>
-            <w:tcBorders>
-              <w:top w:val="single" w:sz="6" w:space="0" w:color="D0D0D0"/>
-              <w:left w:val="single" w:sz="6" w:space="0" w:color="D0D0D0"/>
-              <w:bottom w:val="single" w:sz="6" w:space="0" w:color="D0D0D0"/>
-              <w:right w:val="single" w:sz="6" w:space="0" w:color="D0D0D0"/>
-            </w:tcBorders>
-            <w:tcMar>
-              <w:top w:w="40" w:type="dxa"/>
-              <w:left w:w="50" w:type="dxa"/>
-              <w:bottom w:w="40" w:type="dxa"/>
-              <w:right w:w="50" w:type="dxa"/>
-            </w:tcMar>
-            <w:vAlign w:val="center"/>
-          </w:tcPr>
-          <w:p>
-            <w:pPr>
-              <w:spacing w:before="0" w:after="0" w:line="264" w:lineRule="auto"/>
-              <w:jc w:val="left"/>
-            </w:pPr>
-            <w:r/>
-            <w:r>
-              <w:rPr>
-                <w:rFonts w:ascii="Verdana" w:hAnsi="Verdana" w:cs="Verdana" w:eastAsia="Verdana"/>
-                <w:b w:val="0"/>
-                <w:color w:val="1A1A1A"/>
-                <w:sz w:val="16"/>
-              </w:rPr>
-              <w:t>Передача клиентов, качество сервиса, стыковка процессов</w:t>
+              <w:t>Приоритеты портфеля, KPI, ресурсные решения, эскалации</w:t>
             </w:r>
           </w:p>
         </w:tc>
@@ -5135,7 +4864,7 @@
           <w:color w:val="1A1A1A"/>
           <w:sz w:val="19"/>
         </w:rPr>
-        <w:t>Доля рабочего времени, фактически потраченная на работу с МПП / сделками / канбанами (целевой ориентир ≥ 55–60%).</w:t>
+        <w:t>Качество и своевременность продуктовых стратегий по портфелю (3–5+ продуктов).</w:t>
       </w:r>
     </w:p>
     <w:p>
@@ -5150,7 +4879,52 @@
           <w:color w:val="1A1A1A"/>
           <w:sz w:val="19"/>
         </w:rPr>
-        <w:t>Качество ведения канбанов МПП и доля сделок с понятным next step.</w:t>
+        <w:t>Глубина аналитики базы и влияние выводов на приоритеты обзвона / акций / скриптов.</w:t>
+      </w:r>
+    </w:p>
+    <w:p>
+      <w:pPr>
+        <w:pStyle w:val="ListBullet"/>
+        <w:spacing w:before="0" w:after="40" w:line="264" w:lineRule="auto"/>
+      </w:pPr>
+      <w:r>
+        <w:rPr>
+          <w:rFonts w:ascii="Verdana" w:hAnsi="Verdana" w:cs="Verdana" w:eastAsia="Verdana"/>
+          <w:b w:val="0"/>
+          <w:color w:val="1A1A1A"/>
+          <w:sz w:val="19"/>
+        </w:rPr>
+        <w:t>Качество финансовой аналитики: план-факт, экономика продуктов, мотивация, бюджеты.</w:t>
+      </w:r>
+    </w:p>
+    <w:p>
+      <w:pPr>
+        <w:pStyle w:val="ListBullet"/>
+        <w:spacing w:before="0" w:after="40" w:line="264" w:lineRule="auto"/>
+      </w:pPr>
+      <w:r>
+        <w:rPr>
+          <w:rFonts w:ascii="Verdana" w:hAnsi="Verdana" w:cs="Verdana" w:eastAsia="Verdana"/>
+          <w:b w:val="0"/>
+          <w:color w:val="1A1A1A"/>
+          <w:sz w:val="19"/>
+        </w:rPr>
+        <w:t>Результативность мероприятий и маркетинговых активностей по продвижению сервисов.</w:t>
+      </w:r>
+    </w:p>
+    <w:p>
+      <w:pPr>
+        <w:pStyle w:val="ListBullet"/>
+        <w:spacing w:before="0" w:after="40" w:line="264" w:lineRule="auto"/>
+      </w:pPr>
+      <w:r>
+        <w:rPr>
+          <w:rFonts w:ascii="Verdana" w:hAnsi="Verdana" w:cs="Verdana" w:eastAsia="Verdana"/>
+          <w:b w:val="0"/>
+          <w:color w:val="1A1A1A"/>
+          <w:sz w:val="19"/>
+        </w:rPr>
+        <w:t>Скорость и качество синхронизации со смежными подразделениями по продуктам.</w:t>
       </w:r>
     </w:p>
     <w:p>
@@ -5180,52 +4954,7 @@
           <w:color w:val="1A1A1A"/>
           <w:sz w:val="19"/>
         </w:rPr>
-        <w:t>Уровень соблюдения стандартов / скриптов МПП и качества ведения CRM.</w:t>
-      </w:r>
-    </w:p>
-    <w:p>
-      <w:pPr>
-        <w:pStyle w:val="ListBullet"/>
-        <w:spacing w:before="0" w:after="40" w:line="264" w:lineRule="auto"/>
-      </w:pPr>
-      <w:r>
-        <w:rPr>
-          <w:rFonts w:ascii="Verdana" w:hAnsi="Verdana" w:cs="Verdana" w:eastAsia="Verdana"/>
-          <w:b w:val="0"/>
-          <w:color w:val="1A1A1A"/>
-          <w:sz w:val="19"/>
-        </w:rPr>
-        <w:t>Скорость и качество выхода команды на новый продукт после обучения.</w:t>
-      </w:r>
-    </w:p>
-    <w:p>
-      <w:pPr>
-        <w:pStyle w:val="ListBullet"/>
-        <w:spacing w:before="0" w:after="40" w:line="264" w:lineRule="auto"/>
-      </w:pPr>
-      <w:r>
-        <w:rPr>
-          <w:rFonts w:ascii="Verdana" w:hAnsi="Verdana" w:cs="Verdana" w:eastAsia="Verdana"/>
-          <w:b w:val="0"/>
-          <w:color w:val="1A1A1A"/>
-          <w:sz w:val="19"/>
-        </w:rPr>
-        <w:t>Качество проверки продуктовых и коммерческих гипотез на рынке.</w:t>
-      </w:r>
-    </w:p>
-    <w:p>
-      <w:pPr>
-        <w:pStyle w:val="ListBullet"/>
-        <w:spacing w:before="0" w:after="40" w:line="264" w:lineRule="auto"/>
-      </w:pPr>
-      <w:r>
-        <w:rPr>
-          <w:rFonts w:ascii="Verdana" w:hAnsi="Verdana" w:cs="Verdana" w:eastAsia="Verdana"/>
-          <w:b w:val="0"/>
-          <w:color w:val="1A1A1A"/>
-          <w:sz w:val="19"/>
-        </w:rPr>
-        <w:t>Своевременность стыков со смежными отделами и управляемость бюджета / KPI / мотивации.</w:t>
+        <w:t>Качество канбанов / ключевых сделок МПП и готовность команды к изменениям продуктов.</w:t>
       </w:r>
     </w:p>
     <w:p>

</xml_diff>